<commit_message>
Add the Python basics, agents, and 8-puzzle labs.
</commit_message>
<xml_diff>
--- a/Lab1_Submission.docx
+++ b/Lab1_Submission.docx
@@ -25,7 +25,7 @@
           <w:color w:val="1A365D"/>
           <w:sz w:val="32"/>
         </w:rPr>
-        <w:t>Lab 1 Submission</w:t>
+        <w:t>Lab Submission</w:t>
       </w:r>
     </w:p>
     <w:p/>
@@ -42,7 +42,6 @@
       <w:r>
         <w:rPr>
           <w:color w:val="0563C1"/>
-          <w:sz w:val="24"/>
           <w:u w:val="single"/>
         </w:rPr>
         <w:t>https://github.com/umar9991/Artificial-Intelligence-Lab</w:t>
@@ -50,45 +49,16 @@
     </w:p>
     <w:p>
       <w:r>
-        <w:rPr>
-          <w:i/>
-        </w:rPr>
-        <w:t>This repository contains the Python programs written for Lab 1. They can be opened and run in Google Colab.</w:t>
+        <w:t>Open each notebook in Google Colab, sign in, and run the code cell.</w:t>
       </w:r>
     </w:p>
-    <w:p/>
     <w:p>
       <w:r>
         <w:rPr>
           <w:b/>
           <w:sz w:val="28"/>
         </w:rPr>
-        <w:t>Open the programs in Google Colab</w:t>
-      </w:r>
-    </w:p>
-    <w:p>
-      <w:r>
-        <w:rPr>
-          <w:color w:val="0563C1"/>
-          <w:sz w:val="24"/>
-          <w:u w:val="single"/>
-        </w:rPr>
-        <w:t>https://colab.research.google.com/github/umar9991/Artificial-Intelligence-Lab/blob/main/notebooks/Lab1_Programs.ipynb</w:t>
-      </w:r>
-    </w:p>
-    <w:p>
-      <w:r>
-        <w:t>A Google Colab account is already set up. Open the link above, sign in, and run each program with Shift+Enter.</w:t>
-      </w:r>
-    </w:p>
-    <w:p/>
-    <w:p>
-      <w:r>
-        <w:rPr>
-          <w:b/>
-          <w:sz w:val="28"/>
-        </w:rPr>
-        <w:t>Programs included</w:t>
+        <w:t>Colab notebooks</w:t>
       </w:r>
     </w:p>
     <w:p>
@@ -99,10 +69,16 @@
         <w:rPr>
           <w:b/>
         </w:rPr>
-        <w:t>01_hello_world.py</w:t>
+        <w:t>Python basics assignment</w:t>
       </w:r>
+    </w:p>
+    <w:p>
       <w:r>
-        <w:t xml:space="preserve"> — Hello World and user input</w:t>
+        <w:rPr>
+          <w:color w:val="0563C1"/>
+          <w:u w:val="single"/>
+        </w:rPr>
+        <w:t>https://colab.research.google.com/github/umar9991/Artificial-Intelligence-Lab/blob/main/notebooks/AI_Assignment_Python_Basics.ipynb</w:t>
       </w:r>
     </w:p>
     <w:p>
@@ -113,10 +89,16 @@
         <w:rPr>
           <w:b/>
         </w:rPr>
-        <w:t>02_variables_and_types.py</w:t>
+        <w:t>Lab 1: Intelligent agents</w:t>
       </w:r>
+    </w:p>
+    <w:p>
       <w:r>
-        <w:t xml:space="preserve"> — Variables and data types</w:t>
+        <w:rPr>
+          <w:color w:val="0563C1"/>
+          <w:u w:val="single"/>
+        </w:rPr>
+        <w:t>https://colab.research.google.com/github/umar9991/Artificial-Intelligence-Lab/blob/main/notebooks/Lab1_Introduction_to_AI_Intelligent_Agents.ipynb</w:t>
       </w:r>
     </w:p>
     <w:p>
@@ -127,86 +109,54 @@
         <w:rPr>
           <w:b/>
         </w:rPr>
-        <w:t>03_calculator.py</w:t>
+        <w:t>Lab 2: 8-puzzle and missionaries</w:t>
       </w:r>
+    </w:p>
+    <w:p>
       <w:r>
-        <w:t xml:space="preserve"> — Arithmetic calculator</w:t>
+        <w:rPr>
+          <w:color w:val="0563C1"/>
+          <w:u w:val="single"/>
+        </w:rPr>
+        <w:t>https://colab.research.google.com/github/umar9991/Artificial-Intelligence-Lab/blob/main/notebooks/Lab2_Problem_Formulation_8_Puzzle.ipynb</w:t>
+      </w:r>
+    </w:p>
+    <w:p>
+      <w:r>
+        <w:rPr>
+          <w:b/>
+          <w:sz w:val="28"/>
+        </w:rPr>
+        <w:t>What is included</w:t>
       </w:r>
     </w:p>
     <w:p>
       <w:pPr>
-        <w:pStyle w:val="ListNumber"/>
+        <w:pStyle w:val="ListBullet"/>
       </w:pPr>
       <w:r>
-        <w:rPr>
-          <w:b/>
-        </w:rPr>
-        <w:t>04_conditions.py</w:t>
-      </w:r>
-      <w:r>
-        <w:t xml:space="preserve"> — Conditions: even/odd, sign, and letter grade</w:t>
+        <w:t>Python basics: functions, input, conditions, match-case, loops, lists, and a 2D matrix.</w:t>
       </w:r>
     </w:p>
     <w:p>
       <w:pPr>
-        <w:pStyle w:val="ListNumber"/>
+        <w:pStyle w:val="ListBullet"/>
       </w:pPr>
       <w:r>
-        <w:rPr>
-          <w:b/>
-        </w:rPr>
-        <w:t>05_loops.py</w:t>
-      </w:r>
-      <w:r>
-        <w:t xml:space="preserve"> — Loops: multiplication table, sum, and factorial</w:t>
+        <w:t>Lab 1: PEAS descriptions, reflex and random vacuum agents, a model-based agent, and a 3x3 grid agent.</w:t>
       </w:r>
     </w:p>
     <w:p>
       <w:pPr>
-        <w:pStyle w:val="ListNumber"/>
+        <w:pStyle w:val="ListBullet"/>
       </w:pPr>
       <w:r>
-        <w:rPr>
-          <w:b/>
-        </w:rPr>
-        <w:t>06_lists.py</w:t>
-      </w:r>
-      <w:r>
-        <w:t xml:space="preserve"> — Lists: count, sum, average, minimum, and maximum</w:t>
+        <w:t>Lab 2: 8-puzzle formulation, breadth-first search, solvability, a scaling chart, and missionaries and cannibals.</w:t>
       </w:r>
     </w:p>
     <w:p>
-      <w:pPr>
-        <w:pStyle w:val="ListNumber"/>
-      </w:pPr>
       <w:r>
-        <w:rPr>
-          <w:b/>
-        </w:rPr>
-        <w:t>07_functions.py</w:t>
-      </w:r>
-      <w:r>
-        <w:t xml:space="preserve"> — Functions: area, prime check, and temperature conversion</w:t>
-      </w:r>
-    </w:p>
-    <w:p>
-      <w:pPr>
-        <w:pStyle w:val="ListNumber"/>
-      </w:pPr>
-      <w:r>
-        <w:rPr>
-          <w:b/>
-        </w:rPr>
-        <w:t>08_simple_chatbot.py</w:t>
-      </w:r>
-      <w:r>
-        <w:t xml:space="preserve"> — A small rule-based chatbot</w:t>
-      </w:r>
-    </w:p>
-    <w:p/>
-    <w:p>
-      <w:r>
-        <w:t>Individual source files are in the programs folder. The same programs are combined in notebooks/Lab1_Programs.ipynb.</w:t>
+        <w:t>The same Python files are in the programs folder of the repository.</w:t>
       </w:r>
     </w:p>
     <w:sectPr>

</xml_diff>